<commit_message>
docs(report): update section 2 eda analysis and figures
</commit_message>
<xml_diff>
--- a/report/CMP6202.docx
+++ b/report/CMP6202.docx
@@ -5332,18 +5332,104 @@
       <w:bookmarkEnd w:id="8"/>
     </w:p>
     <w:p>
-      <w:pPr>
-        <w:spacing w:line="276" w:lineRule="auto"/>
-        <w:ind w:firstLine="709"/>
-        <w:rPr>
-          <w:color w:val="EE0000"/>
-        </w:rPr>
-      </w:pPr>
-      <w:r>
-        <w:rPr>
-          <w:color w:val="EE0000"/>
-        </w:rPr>
-        <w:t>Provide an overview of the topics discussed and information presented. What conclusions have you drawn thus far from the dataset?</w:t>
+      <w:r>
+        <w:t>The exploratory data analysis of the 4,178 English Premier League fixtures establishes four core findings that guide our downstream experimental design:</w:t>
+      </w:r>
+    </w:p>
+    <w:p>
+      <w:pPr>
+        <w:pStyle w:val="Prrafodelista"/>
+        <w:numPr>
+          <w:ilvl w:val="0"/>
+          <w:numId w:val="37"/>
+        </w:numPr>
+      </w:pPr>
+      <w:r>
+        <w:t xml:space="preserve">Target Distribution and Baseline Accuracy: The binary target variable </w:t>
+      </w:r>
+      <w:proofErr w:type="spellStart"/>
+      <w:r>
+        <w:t>HomeWin</w:t>
+      </w:r>
+      <w:proofErr w:type="spellEnd"/>
+      <w:r>
+        <w:t xml:space="preserve"> reveals a natural distribution of 44.93% home victories and 55.07% non-home outcomes (draws and away victories combined). This establishes a naive majority-class baseline of 55.07%. Because the minority class represents nearly 45% of total instances, the dataset does not suffer from acute class imbalance, rendering synthetic resampling methods (such as SMOTE) unnecessary.</w:t>
+      </w:r>
+    </w:p>
+    <w:p>
+      <w:pPr>
+        <w:pStyle w:val="Prrafodelista"/>
+        <w:numPr>
+          <w:ilvl w:val="0"/>
+          <w:numId w:val="37"/>
+        </w:numPr>
+      </w:pPr>
+      <w:r>
+        <w:t>Discriminative Feature Signals: Pre-match team rating differentials (</w:t>
+      </w:r>
+      <w:proofErr w:type="spellStart"/>
+      <w:r>
+        <w:t>EloDiff</w:t>
+      </w:r>
+      <w:proofErr w:type="spellEnd"/>
+      <w:r>
+        <w:t>) and opening market odds (</w:t>
+      </w:r>
+      <w:proofErr w:type="spellStart"/>
+      <w:r>
+        <w:t>OddHome</w:t>
+      </w:r>
+      <w:proofErr w:type="spellEnd"/>
+      <w:r>
+        <w:t xml:space="preserve">, </w:t>
+      </w:r>
+      <w:proofErr w:type="spellStart"/>
+      <w:r>
+        <w:t>OddAway</w:t>
+      </w:r>
+      <w:proofErr w:type="spellEnd"/>
+      <w:r>
+        <w:t xml:space="preserve">) display the strongest correlations with match outcomes. The clear separation between positive and negative differential medians verifies that historical team quality provides a robust discriminative signal prior to </w:t>
+      </w:r>
+      <w:proofErr w:type="spellStart"/>
+      <w:r>
+        <w:t>kickoff</w:t>
+      </w:r>
+      <w:proofErr w:type="spellEnd"/>
+      <w:r>
+        <w:t xml:space="preserve"> without inducing temporal data leakage.</w:t>
+      </w:r>
+    </w:p>
+    <w:p>
+      <w:pPr>
+        <w:pStyle w:val="Prrafodelista"/>
+        <w:numPr>
+          <w:ilvl w:val="0"/>
+          <w:numId w:val="37"/>
+        </w:numPr>
+      </w:pPr>
+      <w:r>
+        <w:t>Multicollinearity and Redundancy: High pairwise collinearity between rolling form windows (Form3 and Form5, r = 0.83) demonstrates redundant momentum signals. Consequently, feature selection should consolidate form metrics to prevent variance inflation in linear models. Furthermore, the presence of non-linear dynamics between club ratings and match outcomes motivates the adoption of non-linear tree ensembles alongside linear baselines.</w:t>
+      </w:r>
+    </w:p>
+    <w:p>
+      <w:pPr>
+        <w:pStyle w:val="Prrafodelista"/>
+        <w:numPr>
+          <w:ilvl w:val="0"/>
+          <w:numId w:val="37"/>
+        </w:numPr>
+      </w:pPr>
+      <w:r>
+        <w:t>Feature Magnitude and Transformation Strategy: Disparities across measurement scales—ranging from hundreds of Elo points to small decimal betting odds—make standardized scaling (</w:t>
+      </w:r>
+      <w:proofErr w:type="spellStart"/>
+      <w:r>
+        <w:t>StandardScaler</w:t>
+      </w:r>
+      <w:proofErr w:type="spellEnd"/>
+      <w:r>
+        <w:t>) necessary for distance-based and margin-based classifiers (such as k-NN, Logistic Regression, and Support Vector Machines) to prevent larger magnitude features from dominating distance calculations.</w:t>
       </w:r>
     </w:p>
     <w:p>
@@ -5358,6 +5444,7 @@
       </w:pPr>
       <w:bookmarkStart w:id="9" w:name="_Toc239515009"/>
       <w:r>
+        <w:lastRenderedPageBreak/>
         <w:t>Experimental Design</w:t>
       </w:r>
       <w:bookmarkEnd w:id="9"/>
@@ -5564,7 +5651,6 @@
       </w:pPr>
       <w:bookmarkStart w:id="14" w:name="_Toc239515014"/>
       <w:r>
-        <w:lastRenderedPageBreak/>
         <w:t>Predictive Modelling / Model Development</w:t>
       </w:r>
       <w:bookmarkEnd w:id="14"/>
@@ -5703,6 +5789,7 @@
         <w:rPr>
           <w:color w:val="EE0000"/>
         </w:rPr>
+        <w:lastRenderedPageBreak/>
         <w:t>Present relevant code snippets and visualisations to focus your discussion for this process.</w:t>
       </w:r>
     </w:p>
@@ -5934,7 +6021,6 @@
           <w:color w:val="EE0000"/>
           <w:u w:val="single"/>
         </w:rPr>
-        <w:lastRenderedPageBreak/>
         <w:t>Step 4: Model Evaluation</w:t>
       </w:r>
     </w:p>
@@ -6051,6 +6137,7 @@
         <w:rPr>
           <w:color w:val="EE0000"/>
         </w:rPr>
+        <w:lastRenderedPageBreak/>
         <w:t>Feature Engineering: Explore feature engineering techniques that may improve your model, such as creating new features, transforming existing ones, or feature selection.</w:t>
       </w:r>
     </w:p>
@@ -6256,7 +6343,6 @@
         <w:rPr>
           <w:color w:val="EE0000"/>
         </w:rPr>
-        <w:lastRenderedPageBreak/>
         <w:t xml:space="preserve">Summarise your current results from the model development process, including the problem, data, methodology, results, and insights. </w:t>
       </w:r>
     </w:p>
@@ -6364,6 +6450,7 @@
       </w:pPr>
       <w:bookmarkStart w:id="21" w:name="_Toc239515021"/>
       <w:r>
+        <w:lastRenderedPageBreak/>
         <w:t>GitHub link</w:t>
       </w:r>
       <w:bookmarkEnd w:id="21"/>
@@ -7079,6 +7166,92 @@
     </w:lvl>
   </w:abstractNum>
   <w:abstractNum w:abstractNumId="3" w15:restartNumberingAfterBreak="0">
+    <w:nsid w:val="059E3871"/>
+    <w:multiLevelType w:val="hybridMultilevel"/>
+    <w:tmpl w:val="F0BC0A66"/>
+    <w:lvl w:ilvl="0" w:tplc="040A000F">
+      <w:start w:val="1"/>
+      <w:numFmt w:val="decimal"/>
+      <w:lvlText w:val="%1."/>
+      <w:lvlJc w:val="left"/>
+      <w:pPr>
+        <w:ind w:left="720" w:hanging="360"/>
+      </w:pPr>
+    </w:lvl>
+    <w:lvl w:ilvl="1" w:tplc="040A0019" w:tentative="1">
+      <w:start w:val="1"/>
+      <w:numFmt w:val="lowerLetter"/>
+      <w:lvlText w:val="%2."/>
+      <w:lvlJc w:val="left"/>
+      <w:pPr>
+        <w:ind w:left="1440" w:hanging="360"/>
+      </w:pPr>
+    </w:lvl>
+    <w:lvl w:ilvl="2" w:tplc="040A001B" w:tentative="1">
+      <w:start w:val="1"/>
+      <w:numFmt w:val="lowerRoman"/>
+      <w:lvlText w:val="%3."/>
+      <w:lvlJc w:val="right"/>
+      <w:pPr>
+        <w:ind w:left="2160" w:hanging="180"/>
+      </w:pPr>
+    </w:lvl>
+    <w:lvl w:ilvl="3" w:tplc="040A000F" w:tentative="1">
+      <w:start w:val="1"/>
+      <w:numFmt w:val="decimal"/>
+      <w:lvlText w:val="%4."/>
+      <w:lvlJc w:val="left"/>
+      <w:pPr>
+        <w:ind w:left="2880" w:hanging="360"/>
+      </w:pPr>
+    </w:lvl>
+    <w:lvl w:ilvl="4" w:tplc="040A0019" w:tentative="1">
+      <w:start w:val="1"/>
+      <w:numFmt w:val="lowerLetter"/>
+      <w:lvlText w:val="%5."/>
+      <w:lvlJc w:val="left"/>
+      <w:pPr>
+        <w:ind w:left="3600" w:hanging="360"/>
+      </w:pPr>
+    </w:lvl>
+    <w:lvl w:ilvl="5" w:tplc="040A001B" w:tentative="1">
+      <w:start w:val="1"/>
+      <w:numFmt w:val="lowerRoman"/>
+      <w:lvlText w:val="%6."/>
+      <w:lvlJc w:val="right"/>
+      <w:pPr>
+        <w:ind w:left="4320" w:hanging="180"/>
+      </w:pPr>
+    </w:lvl>
+    <w:lvl w:ilvl="6" w:tplc="040A000F" w:tentative="1">
+      <w:start w:val="1"/>
+      <w:numFmt w:val="decimal"/>
+      <w:lvlText w:val="%7."/>
+      <w:lvlJc w:val="left"/>
+      <w:pPr>
+        <w:ind w:left="5040" w:hanging="360"/>
+      </w:pPr>
+    </w:lvl>
+    <w:lvl w:ilvl="7" w:tplc="040A0019" w:tentative="1">
+      <w:start w:val="1"/>
+      <w:numFmt w:val="lowerLetter"/>
+      <w:lvlText w:val="%8."/>
+      <w:lvlJc w:val="left"/>
+      <w:pPr>
+        <w:ind w:left="5760" w:hanging="360"/>
+      </w:pPr>
+    </w:lvl>
+    <w:lvl w:ilvl="8" w:tplc="040A001B" w:tentative="1">
+      <w:start w:val="1"/>
+      <w:numFmt w:val="lowerRoman"/>
+      <w:lvlText w:val="%9."/>
+      <w:lvlJc w:val="right"/>
+      <w:pPr>
+        <w:ind w:left="6480" w:hanging="180"/>
+      </w:pPr>
+    </w:lvl>
+  </w:abstractNum>
+  <w:abstractNum w:abstractNumId="4" w15:restartNumberingAfterBreak="0">
     <w:nsid w:val="06CC7241"/>
     <w:multiLevelType w:val="multilevel"/>
     <w:tmpl w:val="9B7A04F0"/>
@@ -7194,7 +7367,7 @@
       </w:rPr>
     </w:lvl>
   </w:abstractNum>
-  <w:abstractNum w:abstractNumId="4" w15:restartNumberingAfterBreak="0">
+  <w:abstractNum w:abstractNumId="5" w15:restartNumberingAfterBreak="0">
     <w:nsid w:val="0B5B4C15"/>
     <w:multiLevelType w:val="hybridMultilevel"/>
     <w:tmpl w:val="07E08A98"/>
@@ -7307,7 +7480,7 @@
       </w:rPr>
     </w:lvl>
   </w:abstractNum>
-  <w:abstractNum w:abstractNumId="5" w15:restartNumberingAfterBreak="0">
+  <w:abstractNum w:abstractNumId="6" w15:restartNumberingAfterBreak="0">
     <w:nsid w:val="0FF2635F"/>
     <w:multiLevelType w:val="multilevel"/>
     <w:tmpl w:val="0809001F"/>
@@ -7393,7 +7566,7 @@
       </w:pPr>
     </w:lvl>
   </w:abstractNum>
-  <w:abstractNum w:abstractNumId="6" w15:restartNumberingAfterBreak="0">
+  <w:abstractNum w:abstractNumId="7" w15:restartNumberingAfterBreak="0">
     <w:nsid w:val="10B22CA0"/>
     <w:multiLevelType w:val="hybridMultilevel"/>
     <w:tmpl w:val="5B9CEE68"/>
@@ -7533,7 +7706,7 @@
       </w:rPr>
     </w:lvl>
   </w:abstractNum>
-  <w:abstractNum w:abstractNumId="7" w15:restartNumberingAfterBreak="0">
+  <w:abstractNum w:abstractNumId="8" w15:restartNumberingAfterBreak="0">
     <w:nsid w:val="15C01EF8"/>
     <w:multiLevelType w:val="hybridMultilevel"/>
     <w:tmpl w:val="9C3C1254"/>
@@ -7646,7 +7819,7 @@
       </w:rPr>
     </w:lvl>
   </w:abstractNum>
-  <w:abstractNum w:abstractNumId="8" w15:restartNumberingAfterBreak="0">
+  <w:abstractNum w:abstractNumId="9" w15:restartNumberingAfterBreak="0">
     <w:nsid w:val="193F2DC3"/>
     <w:multiLevelType w:val="hybridMultilevel"/>
     <w:tmpl w:val="912AA536"/>
@@ -7732,7 +7905,7 @@
       </w:pPr>
     </w:lvl>
   </w:abstractNum>
-  <w:abstractNum w:abstractNumId="9" w15:restartNumberingAfterBreak="0">
+  <w:abstractNum w:abstractNumId="10" w15:restartNumberingAfterBreak="0">
     <w:nsid w:val="228A3645"/>
     <w:multiLevelType w:val="multilevel"/>
     <w:tmpl w:val="ED2AF4FC"/>
@@ -7823,7 +7996,7 @@
       </w:pPr>
     </w:lvl>
   </w:abstractNum>
-  <w:abstractNum w:abstractNumId="10" w15:restartNumberingAfterBreak="0">
+  <w:abstractNum w:abstractNumId="11" w15:restartNumberingAfterBreak="0">
     <w:nsid w:val="22B943A2"/>
     <w:multiLevelType w:val="hybridMultilevel"/>
     <w:tmpl w:val="E36055EA"/>
@@ -7936,7 +8109,7 @@
       </w:rPr>
     </w:lvl>
   </w:abstractNum>
-  <w:abstractNum w:abstractNumId="11" w15:restartNumberingAfterBreak="0">
+  <w:abstractNum w:abstractNumId="12" w15:restartNumberingAfterBreak="0">
     <w:nsid w:val="23A53BD1"/>
     <w:multiLevelType w:val="hybridMultilevel"/>
     <w:tmpl w:val="E55EC878"/>
@@ -8049,7 +8222,7 @@
       </w:rPr>
     </w:lvl>
   </w:abstractNum>
-  <w:abstractNum w:abstractNumId="12" w15:restartNumberingAfterBreak="0">
+  <w:abstractNum w:abstractNumId="13" w15:restartNumberingAfterBreak="0">
     <w:nsid w:val="260953C4"/>
     <w:multiLevelType w:val="hybridMultilevel"/>
     <w:tmpl w:val="81AE9174"/>
@@ -8162,7 +8335,7 @@
       </w:rPr>
     </w:lvl>
   </w:abstractNum>
-  <w:abstractNum w:abstractNumId="13" w15:restartNumberingAfterBreak="0">
+  <w:abstractNum w:abstractNumId="14" w15:restartNumberingAfterBreak="0">
     <w:nsid w:val="290A2F44"/>
     <w:multiLevelType w:val="hybridMultilevel"/>
     <w:tmpl w:val="58AAD714"/>
@@ -8275,7 +8448,7 @@
       </w:rPr>
     </w:lvl>
   </w:abstractNum>
-  <w:abstractNum w:abstractNumId="14" w15:restartNumberingAfterBreak="0">
+  <w:abstractNum w:abstractNumId="15" w15:restartNumberingAfterBreak="0">
     <w:nsid w:val="2D834594"/>
     <w:multiLevelType w:val="hybridMultilevel"/>
     <w:tmpl w:val="96387214"/>
@@ -8388,7 +8561,7 @@
       </w:rPr>
     </w:lvl>
   </w:abstractNum>
-  <w:abstractNum w:abstractNumId="15" w15:restartNumberingAfterBreak="0">
+  <w:abstractNum w:abstractNumId="16" w15:restartNumberingAfterBreak="0">
     <w:nsid w:val="3295473D"/>
     <w:multiLevelType w:val="hybridMultilevel"/>
     <w:tmpl w:val="B6DA7A24"/>
@@ -8501,7 +8674,7 @@
       </w:rPr>
     </w:lvl>
   </w:abstractNum>
-  <w:abstractNum w:abstractNumId="16" w15:restartNumberingAfterBreak="0">
+  <w:abstractNum w:abstractNumId="17" w15:restartNumberingAfterBreak="0">
     <w:nsid w:val="337B3C4B"/>
     <w:multiLevelType w:val="hybridMultilevel"/>
     <w:tmpl w:val="7542E0D4"/>
@@ -8587,7 +8760,7 @@
       </w:pPr>
     </w:lvl>
   </w:abstractNum>
-  <w:abstractNum w:abstractNumId="17" w15:restartNumberingAfterBreak="0">
+  <w:abstractNum w:abstractNumId="18" w15:restartNumberingAfterBreak="0">
     <w:nsid w:val="35F82720"/>
     <w:multiLevelType w:val="hybridMultilevel"/>
     <w:tmpl w:val="829035B4"/>
@@ -8673,7 +8846,7 @@
       </w:pPr>
     </w:lvl>
   </w:abstractNum>
-  <w:abstractNum w:abstractNumId="18" w15:restartNumberingAfterBreak="0">
+  <w:abstractNum w:abstractNumId="19" w15:restartNumberingAfterBreak="0">
     <w:nsid w:val="38CA4B7F"/>
     <w:multiLevelType w:val="hybridMultilevel"/>
     <w:tmpl w:val="F32A2E3E"/>
@@ -8786,7 +8959,7 @@
       </w:rPr>
     </w:lvl>
   </w:abstractNum>
-  <w:abstractNum w:abstractNumId="19" w15:restartNumberingAfterBreak="0">
+  <w:abstractNum w:abstractNumId="20" w15:restartNumberingAfterBreak="0">
     <w:nsid w:val="3A45169B"/>
     <w:multiLevelType w:val="hybridMultilevel"/>
     <w:tmpl w:val="6C902DEC"/>
@@ -8899,7 +9072,7 @@
       </w:rPr>
     </w:lvl>
   </w:abstractNum>
-  <w:abstractNum w:abstractNumId="20" w15:restartNumberingAfterBreak="0">
+  <w:abstractNum w:abstractNumId="21" w15:restartNumberingAfterBreak="0">
     <w:nsid w:val="3D702E02"/>
     <w:multiLevelType w:val="hybridMultilevel"/>
     <w:tmpl w:val="710E812E"/>
@@ -8985,7 +9158,7 @@
       </w:pPr>
     </w:lvl>
   </w:abstractNum>
-  <w:abstractNum w:abstractNumId="21" w15:restartNumberingAfterBreak="0">
+  <w:abstractNum w:abstractNumId="22" w15:restartNumberingAfterBreak="0">
     <w:nsid w:val="3E09312F"/>
     <w:multiLevelType w:val="hybridMultilevel"/>
     <w:tmpl w:val="4F0CE768"/>
@@ -9098,7 +9271,7 @@
       </w:rPr>
     </w:lvl>
   </w:abstractNum>
-  <w:abstractNum w:abstractNumId="22" w15:restartNumberingAfterBreak="0">
+  <w:abstractNum w:abstractNumId="23" w15:restartNumberingAfterBreak="0">
     <w:nsid w:val="3EB026DD"/>
     <w:multiLevelType w:val="hybridMultilevel"/>
     <w:tmpl w:val="2842F19A"/>
@@ -9211,7 +9384,7 @@
       </w:rPr>
     </w:lvl>
   </w:abstractNum>
-  <w:abstractNum w:abstractNumId="23" w15:restartNumberingAfterBreak="0">
+  <w:abstractNum w:abstractNumId="24" w15:restartNumberingAfterBreak="0">
     <w:nsid w:val="4381731F"/>
     <w:multiLevelType w:val="multilevel"/>
     <w:tmpl w:val="61FEB51E"/>
@@ -9360,7 +9533,7 @@
       </w:rPr>
     </w:lvl>
   </w:abstractNum>
-  <w:abstractNum w:abstractNumId="24" w15:restartNumberingAfterBreak="0">
+  <w:abstractNum w:abstractNumId="25" w15:restartNumberingAfterBreak="0">
     <w:nsid w:val="534412A0"/>
     <w:multiLevelType w:val="hybridMultilevel"/>
     <w:tmpl w:val="FF282D7E"/>
@@ -9473,7 +9646,7 @@
       </w:rPr>
     </w:lvl>
   </w:abstractNum>
-  <w:abstractNum w:abstractNumId="25" w15:restartNumberingAfterBreak="0">
+  <w:abstractNum w:abstractNumId="26" w15:restartNumberingAfterBreak="0">
     <w:nsid w:val="5890503C"/>
     <w:multiLevelType w:val="hybridMultilevel"/>
     <w:tmpl w:val="07161254"/>
@@ -9586,7 +9759,7 @@
       </w:rPr>
     </w:lvl>
   </w:abstractNum>
-  <w:abstractNum w:abstractNumId="26" w15:restartNumberingAfterBreak="0">
+  <w:abstractNum w:abstractNumId="27" w15:restartNumberingAfterBreak="0">
     <w:nsid w:val="5C2F3EFA"/>
     <w:multiLevelType w:val="hybridMultilevel"/>
     <w:tmpl w:val="6D0E2038"/>
@@ -9699,7 +9872,7 @@
       </w:rPr>
     </w:lvl>
   </w:abstractNum>
-  <w:abstractNum w:abstractNumId="27" w15:restartNumberingAfterBreak="0">
+  <w:abstractNum w:abstractNumId="28" w15:restartNumberingAfterBreak="0">
     <w:nsid w:val="61E43977"/>
     <w:multiLevelType w:val="hybridMultilevel"/>
     <w:tmpl w:val="85F22F92"/>
@@ -9812,7 +9985,7 @@
       </w:rPr>
     </w:lvl>
   </w:abstractNum>
-  <w:abstractNum w:abstractNumId="28" w15:restartNumberingAfterBreak="0">
+  <w:abstractNum w:abstractNumId="29" w15:restartNumberingAfterBreak="0">
     <w:nsid w:val="64BF37F6"/>
     <w:multiLevelType w:val="hybridMultilevel"/>
     <w:tmpl w:val="0762B5C6"/>
@@ -9925,7 +10098,7 @@
       </w:rPr>
     </w:lvl>
   </w:abstractNum>
-  <w:abstractNum w:abstractNumId="29" w15:restartNumberingAfterBreak="0">
+  <w:abstractNum w:abstractNumId="30" w15:restartNumberingAfterBreak="0">
     <w:nsid w:val="675326B6"/>
     <w:multiLevelType w:val="hybridMultilevel"/>
     <w:tmpl w:val="85266EFA"/>
@@ -10038,7 +10211,7 @@
       </w:rPr>
     </w:lvl>
   </w:abstractNum>
-  <w:abstractNum w:abstractNumId="30" w15:restartNumberingAfterBreak="0">
+  <w:abstractNum w:abstractNumId="31" w15:restartNumberingAfterBreak="0">
     <w:nsid w:val="68B64D28"/>
     <w:multiLevelType w:val="hybridMultilevel"/>
     <w:tmpl w:val="7BE0DB88"/>
@@ -10151,7 +10324,7 @@
       </w:rPr>
     </w:lvl>
   </w:abstractNum>
-  <w:abstractNum w:abstractNumId="31" w15:restartNumberingAfterBreak="0">
+  <w:abstractNum w:abstractNumId="32" w15:restartNumberingAfterBreak="0">
     <w:nsid w:val="7173136D"/>
     <w:multiLevelType w:val="hybridMultilevel"/>
     <w:tmpl w:val="CABE53B8"/>
@@ -10264,7 +10437,7 @@
       </w:rPr>
     </w:lvl>
   </w:abstractNum>
-  <w:abstractNum w:abstractNumId="32" w15:restartNumberingAfterBreak="0">
+  <w:abstractNum w:abstractNumId="33" w15:restartNumberingAfterBreak="0">
     <w:nsid w:val="745520BA"/>
     <w:multiLevelType w:val="hybridMultilevel"/>
     <w:tmpl w:val="83DE48DE"/>
@@ -10377,7 +10550,7 @@
       </w:rPr>
     </w:lvl>
   </w:abstractNum>
-  <w:abstractNum w:abstractNumId="33" w15:restartNumberingAfterBreak="0">
+  <w:abstractNum w:abstractNumId="34" w15:restartNumberingAfterBreak="0">
     <w:nsid w:val="765B5DFE"/>
     <w:multiLevelType w:val="hybridMultilevel"/>
     <w:tmpl w:val="204676FE"/>
@@ -10466,7 +10639,7 @@
       </w:pPr>
     </w:lvl>
   </w:abstractNum>
-  <w:abstractNum w:abstractNumId="34" w15:restartNumberingAfterBreak="0">
+  <w:abstractNum w:abstractNumId="35" w15:restartNumberingAfterBreak="0">
     <w:nsid w:val="79237F68"/>
     <w:multiLevelType w:val="hybridMultilevel"/>
     <w:tmpl w:val="E76EFD42"/>
@@ -10579,7 +10752,7 @@
       </w:rPr>
     </w:lvl>
   </w:abstractNum>
-  <w:abstractNum w:abstractNumId="35" w15:restartNumberingAfterBreak="0">
+  <w:abstractNum w:abstractNumId="36" w15:restartNumberingAfterBreak="0">
     <w:nsid w:val="79754F14"/>
     <w:multiLevelType w:val="hybridMultilevel"/>
     <w:tmpl w:val="0108FEE6"/>
@@ -10696,109 +10869,112 @@
     <w:abstractNumId w:val="2"/>
   </w:num>
   <w:num w:numId="2" w16cid:durableId="12807115">
+    <w:abstractNumId w:val="6"/>
+  </w:num>
+  <w:num w:numId="3" w16cid:durableId="2130122349">
+    <w:abstractNumId w:val="4"/>
+  </w:num>
+  <w:num w:numId="4" w16cid:durableId="879172214">
+    <w:abstractNumId w:val="31"/>
+  </w:num>
+  <w:num w:numId="5" w16cid:durableId="827795016">
+    <w:abstractNumId w:val="23"/>
+  </w:num>
+  <w:num w:numId="6" w16cid:durableId="1204945789">
+    <w:abstractNumId w:val="34"/>
+  </w:num>
+  <w:num w:numId="7" w16cid:durableId="574827965">
+    <w:abstractNumId w:val="10"/>
+  </w:num>
+  <w:num w:numId="8" w16cid:durableId="1887327410">
     <w:abstractNumId w:val="5"/>
   </w:num>
-  <w:num w:numId="3" w16cid:durableId="2130122349">
-    <w:abstractNumId w:val="3"/>
+  <w:num w:numId="9" w16cid:durableId="2123763280">
+    <w:abstractNumId w:val="19"/>
   </w:num>
-  <w:num w:numId="4" w16cid:durableId="879172214">
-    <w:abstractNumId w:val="30"/>
+  <w:num w:numId="10" w16cid:durableId="2043088868">
+    <w:abstractNumId w:val="27"/>
   </w:num>
-  <w:num w:numId="5" w16cid:durableId="827795016">
+  <w:num w:numId="11" w16cid:durableId="41564945">
     <w:abstractNumId w:val="22"/>
   </w:num>
-  <w:num w:numId="6" w16cid:durableId="1204945789">
-    <w:abstractNumId w:val="33"/>
+  <w:num w:numId="12" w16cid:durableId="28839483">
+    <w:abstractNumId w:val="11"/>
   </w:num>
-  <w:num w:numId="7" w16cid:durableId="574827965">
-    <w:abstractNumId w:val="9"/>
+  <w:num w:numId="13" w16cid:durableId="1516264568">
+    <w:abstractNumId w:val="20"/>
   </w:num>
-  <w:num w:numId="8" w16cid:durableId="1887327410">
-    <w:abstractNumId w:val="4"/>
-  </w:num>
-  <w:num w:numId="9" w16cid:durableId="2123763280">
-    <w:abstractNumId w:val="18"/>
-  </w:num>
-  <w:num w:numId="10" w16cid:durableId="2043088868">
+  <w:num w:numId="14" w16cid:durableId="1723796260">
     <w:abstractNumId w:val="26"/>
   </w:num>
-  <w:num w:numId="11" w16cid:durableId="41564945">
-    <w:abstractNumId w:val="21"/>
-  </w:num>
-  <w:num w:numId="12" w16cid:durableId="28839483">
-    <w:abstractNumId w:val="10"/>
-  </w:num>
-  <w:num w:numId="13" w16cid:durableId="1516264568">
-    <w:abstractNumId w:val="19"/>
-  </w:num>
-  <w:num w:numId="14" w16cid:durableId="1723796260">
+  <w:num w:numId="15" w16cid:durableId="1114980172">
     <w:abstractNumId w:val="25"/>
   </w:num>
-  <w:num w:numId="15" w16cid:durableId="1114980172">
-    <w:abstractNumId w:val="24"/>
-  </w:num>
   <w:num w:numId="16" w16cid:durableId="889732599">
-    <w:abstractNumId w:val="15"/>
+    <w:abstractNumId w:val="16"/>
   </w:num>
   <w:num w:numId="17" w16cid:durableId="274220422">
-    <w:abstractNumId w:val="31"/>
+    <w:abstractNumId w:val="32"/>
   </w:num>
   <w:num w:numId="18" w16cid:durableId="1847670594">
-    <w:abstractNumId w:val="7"/>
+    <w:abstractNumId w:val="8"/>
   </w:num>
   <w:num w:numId="19" w16cid:durableId="1858301246">
+    <w:abstractNumId w:val="13"/>
+  </w:num>
+  <w:num w:numId="20" w16cid:durableId="1714112257">
     <w:abstractNumId w:val="12"/>
   </w:num>
-  <w:num w:numId="20" w16cid:durableId="1714112257">
-    <w:abstractNumId w:val="11"/>
-  </w:num>
   <w:num w:numId="21" w16cid:durableId="2028670697">
-    <w:abstractNumId w:val="13"/>
+    <w:abstractNumId w:val="14"/>
   </w:num>
   <w:num w:numId="22" w16cid:durableId="781455863">
-    <w:abstractNumId w:val="32"/>
+    <w:abstractNumId w:val="33"/>
   </w:num>
   <w:num w:numId="23" w16cid:durableId="1488328454">
     <w:abstractNumId w:val="1"/>
   </w:num>
   <w:num w:numId="24" w16cid:durableId="2123568229">
-    <w:abstractNumId w:val="8"/>
+    <w:abstractNumId w:val="9"/>
   </w:num>
   <w:num w:numId="25" w16cid:durableId="1607955334">
-    <w:abstractNumId w:val="17"/>
+    <w:abstractNumId w:val="18"/>
   </w:num>
   <w:num w:numId="26" w16cid:durableId="2019503459">
-    <w:abstractNumId w:val="28"/>
+    <w:abstractNumId w:val="29"/>
   </w:num>
   <w:num w:numId="27" w16cid:durableId="1717775844">
-    <w:abstractNumId w:val="6"/>
+    <w:abstractNumId w:val="7"/>
   </w:num>
   <w:num w:numId="28" w16cid:durableId="1648048630">
-    <w:abstractNumId w:val="23"/>
+    <w:abstractNumId w:val="24"/>
   </w:num>
   <w:num w:numId="29" w16cid:durableId="99569502">
     <w:abstractNumId w:val="0"/>
   </w:num>
   <w:num w:numId="30" w16cid:durableId="206841025">
-    <w:abstractNumId w:val="16"/>
+    <w:abstractNumId w:val="17"/>
   </w:num>
   <w:num w:numId="31" w16cid:durableId="823089138">
-    <w:abstractNumId w:val="14"/>
+    <w:abstractNumId w:val="15"/>
   </w:num>
   <w:num w:numId="32" w16cid:durableId="1420322275">
-    <w:abstractNumId w:val="27"/>
+    <w:abstractNumId w:val="28"/>
   </w:num>
   <w:num w:numId="33" w16cid:durableId="610867754">
-    <w:abstractNumId w:val="34"/>
+    <w:abstractNumId w:val="35"/>
   </w:num>
   <w:num w:numId="34" w16cid:durableId="1692295876">
-    <w:abstractNumId w:val="20"/>
+    <w:abstractNumId w:val="21"/>
   </w:num>
   <w:num w:numId="35" w16cid:durableId="1806778351">
-    <w:abstractNumId w:val="35"/>
+    <w:abstractNumId w:val="36"/>
   </w:num>
   <w:num w:numId="36" w16cid:durableId="2107070385">
-    <w:abstractNumId w:val="29"/>
+    <w:abstractNumId w:val="30"/>
+  </w:num>
+  <w:num w:numId="37" w16cid:durableId="324406749">
+    <w:abstractNumId w:val="3"/>
   </w:num>
 </w:numbering>
 </file>

</xml_diff>